<commit_message>
cambios carta gantt 1.5
</commit_message>
<xml_diff>
--- a/fase 1/Evidencias_Grupales/1.5_GuiaEstudiante_Fase 1_Definicion Proyecto APT(Español).docx
+++ b/fase 1/Evidencias_Grupales/1.5_GuiaEstudiante_Fase 1_Definicion Proyecto APT(Español).docx
@@ -234,12 +234,12 @@
                 <wp:extent cx="6580505" cy="1486535"/>
                 <wp:effectExtent b="0" l="0" r="0" t="0"/>
                 <wp:wrapNone/>
-                <wp:docPr id="48" name="image2.png"/>
+                <wp:docPr id="48" name="image3.png"/>
                 <a:graphic>
                   <a:graphicData uri="http://schemas.openxmlformats.org/drawingml/2006/picture">
                     <pic:pic>
                       <pic:nvPicPr>
-                        <pic:cNvPr id="0" name="image2.png"/>
+                        <pic:cNvPr id="0" name="image3.png"/>
                         <pic:cNvPicPr preferRelativeResize="0"/>
                       </pic:nvPicPr>
                       <pic:blipFill>
@@ -10411,17 +10411,27 @@
         </w:rPr>
       </w:pPr>
       <w:r>
+        <w:rPr>
+          <w:rtl w:val="0"/>
+        </w:rPr>
+      </w:r>
+    </w:p>
+    <w:p>
+      <w:pPr>
+        <w:rPr/>
+      </w:pPr>
+      <w:r>
         <w:rPr/>
         <w:drawing>
           <wp:inline distB="114300" distT="114300" distL="114300" distR="114300">
-            <wp:extent cx="5694998" cy="6106805"/>
+            <wp:extent cx="5399730" cy="6197600"/>
             <wp:effectExtent b="0" l="0" r="0" t="0"/>
-            <wp:docPr id="50" name="image3.jpg"/>
+            <wp:docPr id="49" name="image2.jpg"/>
             <a:graphic>
               <a:graphicData uri="http://schemas.openxmlformats.org/drawingml/2006/picture">
                 <pic:pic>
                   <pic:nvPicPr>
-                    <pic:cNvPr id="0" name="image3.jpg"/>
+                    <pic:cNvPr id="0" name="image2.jpg"/>
                     <pic:cNvPicPr preferRelativeResize="0"/>
                   </pic:nvPicPr>
                   <pic:blipFill>
@@ -10434,7 +10444,7 @@
                   <pic:spPr>
                     <a:xfrm>
                       <a:off x="0" y="0"/>
-                      <a:ext cx="5694998" cy="6106805"/>
+                      <a:ext cx="5399730" cy="6197600"/>
                     </a:xfrm>
                     <a:prstGeom prst="rect"/>
                     <a:ln/>
@@ -10445,16 +10455,6 @@
           </wp:inline>
         </w:drawing>
       </w:r>
-      <w:r>
-        <w:rPr>
-          <w:rtl w:val="0"/>
-        </w:rPr>
-      </w:r>
-    </w:p>
-    <w:p>
-      <w:pPr>
-        <w:rPr/>
-      </w:pPr>
       <w:r>
         <w:rPr>
           <w:rtl w:val="0"/>
@@ -10717,7 +10717,7 @@
               <wp:inline distB="0" distT="0" distL="0" distR="0">
                 <wp:extent cx="1996440" cy="428625"/>
                 <wp:effectExtent b="0" l="0" r="0" t="0"/>
-                <wp:docPr descr="http://www.duoc.cl/normasgraficas/normasgraficas/marca-duoc/6logo-fondo-transparente/fondo-transparente.png" id="49" name="image1.png"/>
+                <wp:docPr descr="http://www.duoc.cl/normasgraficas/normasgraficas/marca-duoc/6logo-fondo-transparente/fondo-transparente.png" id="50" name="image1.png"/>
                 <a:graphic>
                   <a:graphicData uri="http://schemas.openxmlformats.org/drawingml/2006/picture">
                     <pic:pic>

</xml_diff>